<commit_message>
final review of documents in local machine
</commit_message>
<xml_diff>
--- a/CA1_Semester-2_Article_Programming_Paradigms_Michael_Bramwell.docx
+++ b/CA1_Semester-2_Article_Programming_Paradigms_Michael_Bramwell.docx
@@ -25,32 +25,119 @@
           <w:sz w:val="48"/>
           <w:szCs w:val="48"/>
         </w:rPr>
-        <w:t>Programming paradigms for Analytics</w:t>
+        <w:t xml:space="preserve">Programming paradigms for </w:t>
+      </w:r>
+      <w:r>
+        <w:rPr>
+          <w:rFonts w:eastAsia="MS Mincho"/>
+          <w:b/>
+          <w:bCs/>
+          <w:kern w:val="48"/>
+          <w:sz w:val="48"/>
+          <w:szCs w:val="48"/>
+        </w:rPr>
+        <w:t>Data Analytics</w:t>
+      </w:r>
+      <w:r>
+        <w:rPr>
+          <w:rFonts w:eastAsia="MS Mincho"/>
+          <w:b/>
+          <w:bCs/>
+          <w:kern w:val="48"/>
+          <w:sz w:val="48"/>
+          <w:szCs w:val="48"/>
+        </w:rPr>
+        <w:t xml:space="preserve"> </w:t>
       </w:r>
     </w:p>
     <w:p>
       <w:pPr>
         <w:pStyle w:val="Author"/>
-        <w:spacing w:before="5pt" w:beforeAutospacing="1" w:after="5pt" w:afterAutospacing="1" w:line="6pt" w:lineRule="auto"/>
-        <w:rPr>
-          <w:sz w:val="16"/>
-          <w:szCs w:val="16"/>
-        </w:rPr>
-      </w:pPr>
+        <w:spacing w:before="0pt" w:after="0pt"/>
+        <w:jc w:val="center"/>
+        <w:rPr>
+          <w:rFonts w:ascii="Arial" w:hAnsi="Arial" w:cs="Arial"/>
+          <w:b/>
+          <w:color w:val="000000"/>
+        </w:rPr>
+      </w:pPr>
+      <w:r>
+        <w:rPr>
+          <w:rFonts w:ascii="Arial" w:hAnsi="Arial" w:cs="Arial"/>
+          <w:b/>
+          <w:color w:val="000000"/>
+        </w:rPr>
+        <w:t>Michael Alexander Bramwell Layne</w:t>
+      </w:r>
     </w:p>
     <w:p>
       <w:pPr>
         <w:pStyle w:val="Author"/>
-        <w:spacing w:before="5pt" w:beforeAutospacing="1" w:after="5pt" w:afterAutospacing="1" w:line="6pt" w:lineRule="auto"/>
-        <w:rPr>
-          <w:sz w:val="16"/>
-          <w:szCs w:val="16"/>
-        </w:rPr>
+        <w:spacing w:before="0pt" w:after="0pt"/>
+        <w:jc w:val="center"/>
+      </w:pPr>
+      <w:r>
+        <w:rPr>
+          <w:rFonts w:ascii="Arial" w:hAnsi="Arial" w:cs="Arial"/>
+          <w:color w:val="000000"/>
+        </w:rPr>
+        <w:t>MSc in Data Analytics (FT)</w:t>
+      </w:r>
+    </w:p>
+    <w:p>
+      <w:pPr>
+        <w:jc w:val="center"/>
+      </w:pPr>
+      <w:r>
+        <w:rPr>
+          <w:rFonts w:ascii="Arial" w:hAnsi="Arial" w:cs="Arial"/>
+          <w:color w:val="000000"/>
+        </w:rPr>
+        <w:t>CCT College Dublin (Computing, IT, Business)</w:t>
+      </w:r>
+    </w:p>
+    <w:p>
+      <w:pPr>
+        <w:jc w:val="center"/>
+      </w:pPr>
+      <w:r>
+        <w:rPr>
+          <w:rFonts w:ascii="Arial" w:hAnsi="Arial" w:cs="Arial"/>
+          <w:color w:val="000000"/>
+        </w:rPr>
+        <w:t>Dublin, Ireland</w:t>
+      </w:r>
+    </w:p>
+    <w:p>
+      <w:pPr>
+        <w:jc w:val="center"/>
+      </w:pPr>
+      <w:r>
+        <w:rPr>
+          <w:rFonts w:ascii="Arial" w:hAnsi="Arial" w:cs="Arial"/>
+          <w:color w:val="000000"/>
+        </w:rPr>
+        <w:t>2026215@student.cct.ie</w:t>
+      </w:r>
+    </w:p>
+    <w:p>
+      <w:pPr>
+        <w:pStyle w:val="Author"/>
+        <w:spacing w:before="5pt" w:beforeAutospacing="1"/>
+      </w:pPr>
+    </w:p>
+    <w:p>
+      <w:pPr>
         <w:sectPr>
-          <w:footerReference w:type="first" r:id="rId8"/>
+          <w:headerReference w:type="even" r:id="rId8"/>
+          <w:headerReference w:type="default" r:id="rId9"/>
+          <w:footerReference w:type="even" r:id="rId10"/>
+          <w:footerReference w:type="default" r:id="rId11"/>
+          <w:headerReference w:type="first" r:id="rId12"/>
+          <w:footerReference w:type="first" r:id="rId13"/>
           <w:type w:val="continuous"/>
-          <w:pgSz w:w="230.40pt" w:h="1296pt" w:code="9"/>
-          <w:pgMar w:top="0pt" w:right="22.50pt" w:bottom="0pt" w:left="22.50pt" w:header="0pt" w:footer="0pt" w:gutter="0pt"/>
+          <w:pgSz w:w="595.30pt" w:h="841.90pt" w:code="9"/>
+          <w:pgMar w:top="54pt" w:right="42.50pt" w:bottom="54pt" w:left="42.50pt" w:header="0pt" w:footer="0pt" w:gutter="0pt"/>
           <w:cols w:space="36pt"/>
           <w:docGrid w:linePitch="360"/>
         </w:sectPr>
@@ -58,108 +145,6 @@
     </w:p>
     <w:p>
       <w:pPr>
-        <w:jc w:val="center"/>
-      </w:pPr>
-      <w:r>
-        <w:rPr>
-          <w:sz w:val="18"/>
-          <w:szCs w:val="18"/>
-        </w:rPr>
-        <w:br w:type="column"/>
-      </w:r>
-      <w:r>
-        <w:rPr>
-          <w:rFonts w:ascii="Arial" w:hAnsi="Arial" w:cs="Arial"/>
-          <w:b/>
-          <w:color w:val="000000"/>
-        </w:rPr>
-        <w:lastRenderedPageBreak/>
-        <w:t>Michael Alexander Bramwell Layne</w:t>
-      </w:r>
-    </w:p>
-    <w:p>
-      <w:pPr>
-        <w:jc w:val="center"/>
-      </w:pPr>
-      <w:r>
-        <w:rPr>
-          <w:rFonts w:ascii="Arial" w:hAnsi="Arial" w:cs="Arial"/>
-          <w:color w:val="000000"/>
-        </w:rPr>
-        <w:t>MSc in Data Analytics (FT)</w:t>
-      </w:r>
-    </w:p>
-    <w:p>
-      <w:pPr>
-        <w:jc w:val="center"/>
-      </w:pPr>
-      <w:r>
-        <w:rPr>
-          <w:rFonts w:ascii="Arial" w:hAnsi="Arial" w:cs="Arial"/>
-          <w:color w:val="000000"/>
-        </w:rPr>
-        <w:t>CCT College Dublin (Computing, IT, Business)</w:t>
-      </w:r>
-    </w:p>
-    <w:p>
-      <w:pPr>
-        <w:jc w:val="center"/>
-      </w:pPr>
-      <w:r>
-        <w:rPr>
-          <w:rFonts w:ascii="Arial" w:hAnsi="Arial" w:cs="Arial"/>
-          <w:color w:val="000000"/>
-        </w:rPr>
-        <w:t>Dublin, Ireland</w:t>
-      </w:r>
-    </w:p>
-    <w:p>
-      <w:pPr>
-        <w:jc w:val="center"/>
-      </w:pPr>
-      <w:r>
-        <w:rPr>
-          <w:rFonts w:ascii="Arial" w:hAnsi="Arial" w:cs="Arial"/>
-          <w:color w:val="000000"/>
-        </w:rPr>
-        <w:t>2026215@student.cct.ie</w:t>
-      </w:r>
-    </w:p>
-    <w:p>
-      <w:pPr>
-        <w:pStyle w:val="Author"/>
-        <w:spacing w:before="5pt" w:beforeAutospacing="1"/>
-      </w:pPr>
-    </w:p>
-    <w:p>
-      <w:pPr>
-        <w:pStyle w:val="Author"/>
-        <w:spacing w:before="5pt" w:beforeAutospacing="1"/>
-        <w:sectPr>
-          <w:type w:val="continuous"/>
-          <w:pgSz w:w="230.40pt" w:h="1296pt" w:code="9"/>
-          <w:pgMar w:top="0pt" w:right="22.50pt" w:bottom="0pt" w:left="22.50pt" w:header="0pt" w:footer="0pt" w:gutter="0pt"/>
-          <w:cols w:space="36pt"/>
-          <w:docGrid w:linePitch="360"/>
-        </w:sectPr>
-      </w:pPr>
-    </w:p>
-    <w:p>
-      <w:pPr>
-        <w:sectPr>
-          <w:type w:val="continuous"/>
-          <w:pgSz w:w="230.40pt" w:h="1296pt" w:code="9"/>
-          <w:pgMar w:top="0pt" w:right="22.50pt" w:bottom="0pt" w:left="22.50pt" w:header="0pt" w:footer="0pt" w:gutter="0pt"/>
-          <w:cols w:space="36pt"/>
-          <w:docGrid w:linePitch="360"/>
-        </w:sectPr>
-      </w:pPr>
-      <w:r>
-        <w:br w:type="column"/>
-      </w:r>
-    </w:p>
-    <w:p>
-      <w:pPr>
         <w:pStyle w:val="Abstract"/>
         <w:rPr>
           <w:i/>
@@ -174,10 +159,34 @@
         <w:t>Abstract</w:t>
       </w:r>
       <w:r>
-        <w:t>—</w:t>
-      </w:r>
-      <w:r>
-        <w:t>Selecting the right programming paradigm is essential for ensuring optimal performance when processing the continuous logging and analysis of data, thereby maximizing resource utilization. This work examines two primary paradigms that dictate the methodology used to develop specific software solutions. In the case of data analysis, a multi-paradigm approach was employed: functional (declarative) programming was used to retrieve records added over specific time intervals—querying over a thousand records every 24 hours using parallel or distributed storage principles—while the procedural paradigm was utilized to establish connections with the dynamic record data. Implementing multiple paradigms proved necessary to ensure seamless integration with financial classification methods and the proper handling of the stored metadata.</w:t>
+        <w:t xml:space="preserve">: </w:t>
+      </w:r>
+      <w:r>
+        <w:t xml:space="preserve">Selecting the right programming paradigm is essential for ensuring optimal performance when processing the continuous logging and analysis of data, </w:t>
+      </w:r>
+      <w:r>
+        <w:t>in that way</w:t>
+      </w:r>
+      <w:r>
+        <w:t xml:space="preserve"> maximizing resource utilization. This work examines two primary paradigms that dictate the methodology used to develop specific software solutions. In the case of data analysis, a multi-paradigm approach was employed: functional (declarative) programming was used to retrieve records added over specific time intervals</w:t>
+      </w:r>
+      <w:r>
+        <w:t xml:space="preserve"> </w:t>
+      </w:r>
+      <w:r>
+        <w:t>querying over a thousand records every 24 hours using parallel or distributed storage principles</w:t>
+      </w:r>
+      <w:r>
+        <w:t xml:space="preserve"> </w:t>
+      </w:r>
+      <w:r>
+        <w:t xml:space="preserve">while the procedural paradigm was utilized to establish connections with the dynamic record data. Implementing multiple paradigms proved necessary to ensure </w:t>
+      </w:r>
+      <w:r>
+        <w:t>whole</w:t>
+      </w:r>
+      <w:r>
+        <w:t xml:space="preserve"> integration with financial classification methods and the proper handling of the stored metadata.</w:t>
       </w:r>
     </w:p>
     <w:p>
@@ -188,48 +197,69 @@
         </w:rPr>
       </w:pPr>
       <w:r>
-        <w:t>Keywords—</w:t>
+        <w:t>Keywords</w:t>
+      </w:r>
+      <w:r>
+        <w:t>: Bigdata</w:t>
       </w:r>
       <w:r>
         <w:rPr>
           <w:iCs/>
         </w:rPr>
-        <w:t>Metadata, paradigms, programming, data analysis, parallel storage, imperative paradigm, declarative paradigm, procedure paradigm, functional paradigm</w:t>
+        <w:t>, paradigms programming, data analysis, parallel</w:t>
       </w:r>
       <w:r>
         <w:rPr>
           <w:iCs/>
         </w:rPr>
+        <w:t xml:space="preserve"> distribution</w:t>
+      </w:r>
+      <w:r>
+        <w:rPr>
+          <w:iCs/>
+        </w:rPr>
+        <w:t xml:space="preserve">, imperative paradigm, declarative paradigm, </w:t>
+      </w:r>
+      <w:r>
+        <w:rPr>
+          <w:iCs/>
+        </w:rPr>
+        <w:t>convolutional neural networ</w:t>
+      </w:r>
+      <w:r>
+        <w:rPr>
+          <w:iCs/>
+        </w:rPr>
+        <w:t>k, TensorFlow.</w:t>
+      </w:r>
+    </w:p>
+    <w:p>
+      <w:pPr>
+        <w:pStyle w:val="Heading1"/>
+      </w:pPr>
+      <w:r>
+        <w:t>Introduction</w:t>
+      </w:r>
+    </w:p>
+    <w:p>
+      <w:pPr>
+        <w:pStyle w:val="BodyText"/>
+      </w:pPr>
+      <w:r>
+        <w:rPr>
+          <w:lang w:val="en-US"/>
+        </w:rPr>
+        <w:t>Today</w:t>
+      </w:r>
+      <w:r>
+        <w:t>, the Internet acts as a constantly growing global source of information</w:t>
+      </w:r>
+      <w:r>
+        <w:t>. According to IBM, 90% of the world digital data has been generated since 2010, this clearly shows the rapid increase of information in the modern digital age</w:t>
+      </w:r>
+      <w:r>
         <w:t xml:space="preserve"> </w:t>
       </w:r>
-    </w:p>
-    <w:p>
-      <w:pPr>
-        <w:pStyle w:val="Heading1"/>
-      </w:pPr>
-      <w:r>
-        <w:t>Introduction</w:t>
-      </w:r>
-    </w:p>
-    <w:p>
-      <w:pPr>
-        <w:pStyle w:val="BodyText"/>
-      </w:pPr>
-      <w:r>
-        <w:rPr>
-          <w:lang w:val="en-US"/>
-        </w:rPr>
-        <w:t>Today</w:t>
-      </w:r>
-      <w:r>
-        <w:t>, the Internet acts as a constantly growing global source of information</w:t>
-      </w:r>
-      <w:r>
-        <w:t>. According to IBM, 90% of the world digital data has been generated since 2010, this clearly shows the rapid increase of information in the modern digital age</w:t>
-      </w:r>
-      <w:r>
-        <w:t xml:space="preserve"> </w:t>
-      </w:r>
       <w:r>
         <w:fldChar w:fldCharType="begin"/>
       </w:r>
@@ -273,7 +303,13 @@
         <w:t>,</w:t>
       </w:r>
       <w:r>
-        <w:t xml:space="preserve"> However, Programming paradigms offer different methods to solve complex problems in software development, the help manage data distribution for efficient processing and guide code writing using declarative or imperative programming. Therefore, the main goal of this paper is to apply different parallel data distribution with Hadoop and deep learning models such as LSTM and RNN. Finally, we measure the performance of each approach to find the most suitable paradigm for each case</w:t>
+        <w:t xml:space="preserve"> However, Programming paradigms offer different methods to solve complex problems in software development, the help manage data distribution for efficient processing and guide code writing using declarative or imperative programming. Therefore, the main goal of this paper is to apply different parallel data distribution with Hadoop and deep learning models such as </w:t>
+      </w:r>
+      <w:r>
+        <w:t>CNN (Convolutional neural network)</w:t>
+      </w:r>
+      <w:r>
+        <w:t>. Finally, we measure the performance of each approach to find the most suitable paradigm for each case</w:t>
       </w:r>
       <w:r>
         <w:t>.</w:t>
@@ -354,7 +390,13 @@
         <w:rPr>
           <w:lang w:val="en-IE"/>
         </w:rPr>
-        <w:t xml:space="preserve"> instance, functional programming allows developers to create code that is more predictable and concise. On the other hand, imperative programming allows developers to write more detailed and explicit instructions for the computer.</w:t>
+        <w:t xml:space="preserve"> instance, functional programming allows developers to create code that is more predictable and concise. On the other </w:t>
+      </w:r>
+      <w:r>
+        <w:rPr>
+          <w:lang w:val="en-IE"/>
+        </w:rPr>
+        <w:t>hand, imperative programming allows developers to write more detailed and explicit instructions for the computer.</w:t>
       </w:r>
     </w:p>
     <w:p>
@@ -375,7 +417,31 @@
         <w:rPr>
           <w:lang w:val="en-IE"/>
         </w:rPr>
-        <w:t xml:space="preserve"> the most popular programming language to interact with data processing in PySpark, this is mainly due to its flexibility in many programming applications and its easy-to-learn. Specialized libraries like pandas make the data analysis process. They help clean and organize the dataset, preparing it properly for next phase, which involves advanced deep learning models.</w:t>
+        <w:t xml:space="preserve"> the most popular programming language to interact with data processing in PySpark, this is mainly due to its flexibility in many programming </w:t>
+      </w:r>
+      <w:r>
+        <w:rPr>
+          <w:lang w:val="en-IE"/>
+        </w:rPr>
+        <w:t>applications,</w:t>
+      </w:r>
+      <w:r>
+        <w:rPr>
+          <w:lang w:val="en-IE"/>
+        </w:rPr>
+        <w:t xml:space="preserve"> and it</w:t>
+      </w:r>
+      <w:r>
+        <w:rPr>
+          <w:lang w:val="en-IE"/>
+        </w:rPr>
+        <w:t xml:space="preserve"> is easy to learn</w:t>
+      </w:r>
+      <w:r>
+        <w:rPr>
+          <w:lang w:val="en-IE"/>
+        </w:rPr>
+        <w:t>. Specialized libraries like pandas make the data analysis process. They help clean and organize the dataset, preparing it properly for next phase, which involves advanced deep learning models.</w:t>
       </w:r>
     </w:p>
     <w:p>
@@ -390,7 +456,33 @@
         <w:rPr>
           <w:lang w:val="en-IE"/>
         </w:rPr>
-        <w:t>To train our models, we rely on the Tensorflow framework, TensorFlow is very useful because it simplifies the complex mathematics behind deep learning and efficiently manages the large datasets that were processed previously.</w:t>
+        <w:t xml:space="preserve">To train our models, we </w:t>
+      </w:r>
+      <w:r>
+        <w:rPr>
+          <w:lang w:val="en-IE"/>
+        </w:rPr>
+        <w:t>have confidence in</w:t>
+      </w:r>
+      <w:r>
+        <w:rPr>
+          <w:lang w:val="en-IE"/>
+        </w:rPr>
+        <w:t xml:space="preserve"> the </w:t>
+      </w:r>
+      <w:proofErr w:type="spellStart"/>
+      <w:r>
+        <w:rPr>
+          <w:lang w:val="en-IE"/>
+        </w:rPr>
+        <w:t>Tensorflow</w:t>
+      </w:r>
+      <w:proofErr w:type="spellEnd"/>
+      <w:r>
+        <w:rPr>
+          <w:lang w:val="en-IE"/>
+        </w:rPr>
+        <w:t xml:space="preserve"> framework, TensorFlow is very useful because it simplifies the complex mathematics behind deep learning and efficiently manages the large datasets that were processed previously.</w:t>
       </w:r>
     </w:p>
     <w:p>
@@ -407,7 +499,21 @@
           <w:rFonts w:eastAsia="Times New Roman"/>
           <w:lang w:val="en-IE" w:eastAsia="en-IE"/>
         </w:rPr>
-        <w:t>When we analyse visual data, such as digital images with low or high resolution, standard neural networks often have difficulty identifying spatial features. To solve this problem, we use convolutional neural networks (CNNs). These networks are specially designed to automatically identify patterns such as edges, textures and shapes. Traditional models require us to select features manually, while CNNs use special layers called convolutional and pooling layers. These layers reduce the amount of computation needed while keeping visual details. This makes tasks such as recognising objects, classifying images and detecting scenes much faster and more accurate.</w:t>
+        <w:t xml:space="preserve">When we analyse visual data, such as digital images with low or high resolution, standard neural networks often have difficulty identifying spatial features. To solve this problem, we use convolutional neural networks (CNNs). These networks are specially designed to automatically identify patterns such as </w:t>
+      </w:r>
+      <w:r>
+        <w:rPr>
+          <w:rFonts w:eastAsia="Times New Roman"/>
+          <w:lang w:val="en-IE" w:eastAsia="en-IE"/>
+        </w:rPr>
+        <w:t>approaches</w:t>
+      </w:r>
+      <w:r>
+        <w:rPr>
+          <w:rFonts w:eastAsia="Times New Roman"/>
+          <w:lang w:val="en-IE" w:eastAsia="en-IE"/>
+        </w:rPr>
+        <w:t>, textures and shapes. Traditional models require us to select features manually, while CNNs use special layers called convolutional and pooling layers. These layers reduce the amount of computation needed while keeping visual details. This makes tasks such as recognising objects, classifying images and detecting scenes much faster and more accurate.</w:t>
       </w:r>
     </w:p>
     <w:p>
@@ -455,97 +561,78 @@
         <w:rPr>
           <w:lang w:val="en-IE"/>
         </w:rPr>
-        <w:t xml:space="preserve"> additionally, multi-paradirgm programming allows developers to mix different coding styles in one project. Systems built this way are </w:t>
-      </w:r>
-      <w:r>
+        <w:t xml:space="preserve"> additionally, multi-paradirgm programming allows developers to mix different coding styles in one project. Systems built this way are generally faster, cheaper to create, and more reliable than single-style systems</w:t>
+      </w:r>
+    </w:p>
+    <w:p>
+      <w:pPr>
         <w:rPr>
           <w:lang w:val="en-IE"/>
         </w:rPr>
+      </w:pPr>
+      <w:r>
+        <w:rPr>
+          <w:lang w:val="en-IE"/>
+        </w:rPr>
+        <w:t xml:space="preserve"> </w:t>
+      </w:r>
+      <w:r>
+        <w:rPr>
+          <w:lang w:val="en-IE"/>
+        </w:rPr>
+        <w:t>(Samuel, M.S., 2017, p. 13)</w:t>
+      </w:r>
+      <w:r>
+        <w:rPr>
+          <w:lang w:val="en-IE"/>
+        </w:rPr>
+        <w:t>: this style focuses on variables, memory, and simple controls like loops and IF confitions. It shows the computer step-by-step how to calculate an answer</w:t>
+      </w:r>
+    </w:p>
+    <w:p>
+      <w:r>
+        <w:t>Imperative Paradigm</w:t>
+      </w:r>
+      <w:r>
+        <w:t xml:space="preserve">: </w:t>
+      </w:r>
+      <w:r>
+        <w:rPr>
+          <w:lang w:val="en-IE"/>
+        </w:rPr>
+        <w:t xml:space="preserve">this style focuses on variables, memory, and simple controls like loops and IF conditions. It shows the computer step-by-step how to calculate an answer </w:t>
+      </w:r>
+      <w:r>
+        <w:fldChar w:fldCharType="begin"/>
+      </w:r>
+      <w:r>
+        <w:instrText xml:space="preserve"> ADDIN ZOTERO_ITEM CSL_CITATION {"citationID":"ZDb9eB6S","properties":{"unsorted":false,"formattedCitation":"(Vandeloise, 2025, p. 3)","plainCitation":"(Vandeloise, 2025, p. 3)","noteIndex":0},"citationItems":[{"id":4,"uris":["http://zotero.org/users/local/IxyjK0TP/items/6JBZICKN"],"itemData":{"id":4,"type":"article","abstract":"The rise of multi-paradigm languages challenges traditional classification methods, leading to practical software engineering issues like interoperability defects. This systematic literature review (SLR) maps the formal foundations of programming paradigms. Our objective is twofold: (1) to assess the state of the art of classification formalisms and their limitations, and (2) to identify the conceptual primitives and mathematical frameworks for a more powerful, reconstructive approach. Based on a synthesis of 74 primary studies, we find that existing taxonomies lack conceptual granularity, a unified formal basis, and struggle with hybrid languages. In response, our analysis reveals a strong convergence toward a compositional reconstruction of paradigms. This approach identifies a minimal set of orthogonal, atomic primitives and leverages mathematical frameworks, predominantly Type theory, Category theory and Unifying Theories of Programming (UTP), to formally guarantee their compositional properties. We conclude that the literature reflects a significant intellectual shift away from classification towards these promising formal, reconstructive frameworks. This review provides a map of this evolution and proposes a research agenda for their unification.","DOI":"10.48550/arXiv.2508.00534","note":"arXiv:2508.00534 [cs.PL]","number":"arXiv:2508.00534","publisher":"arXiv","source":"arXiv.org","title":"Towards a unified framework for programming paradigms: A systematic review of classification formalisms and methodological foundations","title-short":"Towards a unified framework for programming paradigms","URL":"http://arxiv.org/abs/2508.00534","author":[{"family":"Vandeloise","given":"Mikel"}],"accessed":{"date-parts":[["2026",9,11]]},"issued":{"date-parts":[["2025",8,1]]}},"locator":"3","label":"page"}],"schema":"https://github.com/citation-style-language/schema/raw/master/csl-citation.json"} </w:instrText>
+      </w:r>
+      <w:r>
+        <w:fldChar w:fldCharType="separate"/>
+      </w:r>
+      <w:r>
+        <w:t>(Vandeloise, 2025, p. 3)</w:t>
+      </w:r>
+      <w:r>
+        <w:fldChar w:fldCharType="end"/>
+      </w:r>
+      <w:r>
+        <w:t xml:space="preserve"> .</w:t>
+      </w:r>
+      <w:r>
+        <w:t xml:space="preserve"> </w:t>
+      </w:r>
+    </w:p>
+    <w:p/>
+    <w:p>
+      <w:r>
+        <w:rPr>
+          <w:noProof/>
+        </w:rPr>
         <w:lastRenderedPageBreak/>
-        <w:t>generally faster, cheaper to create, and more reliable than single-style systems</w:t>
-      </w:r>
-    </w:p>
-    <w:p>
-      <w:pPr>
-        <w:rPr>
-          <w:lang w:val="en-IE"/>
-        </w:rPr>
-      </w:pPr>
-      <w:r>
-        <w:rPr>
-          <w:lang w:val="es-US"/>
-        </w:rPr>
-        <w:t xml:space="preserve"> </w:t>
-      </w:r>
-      <w:r>
-        <w:rPr>
-          <w:lang w:val="en-IE"/>
-        </w:rPr>
-        <w:t>(Samuel, M.S., 2017, p. 13)</w:t>
-      </w:r>
-      <w:r>
-        <w:rPr>
-          <w:lang w:val="en-IE"/>
-        </w:rPr>
-        <w:t>: this style focuses on variables, memory, and simple controls like loops and IF confitions. It shows the computer step-by-step how to calculate an answer</w:t>
-      </w:r>
-    </w:p>
-    <w:p>
-      <w:pPr>
-        <w:rPr>
-          <w:lang w:val="en-IE"/>
-        </w:rPr>
-      </w:pPr>
-      <w:r>
-        <w:t>Imperative Paradigm</w:t>
-      </w:r>
-      <w:r>
-        <w:t xml:space="preserve">: </w:t>
-      </w:r>
-      <w:r>
-        <w:rPr>
-          <w:lang w:val="en-IE"/>
-        </w:rPr>
-        <w:t xml:space="preserve">this style focuses on variables, memory, and simple controls like loops and IF conditions. It shows the computer step-by-step how to calculate an answer </w:t>
-      </w:r>
-      <w:r>
-        <w:fldChar w:fldCharType="begin"/>
-      </w:r>
-      <w:r>
-        <w:instrText xml:space="preserve"> ADDIN ZOTERO_ITEM CSL_CITATION {"citationID":"ZDb9eB6S","properties":{"unsorted":false,"formattedCitation":"(Vandeloise, 2025, p. 3)","plainCitation":"(Vandeloise, 2025, p. 3)","noteIndex":0},"citationItems":[{"id":4,"uris":["http://zotero.org/users/local/IxyjK0TP/items/6JBZICKN"],"itemData":{"id":4,"type":"article","abstract":"The rise of multi-paradigm languages challenges traditional classification methods, leading to practical software engineering issues like interoperability defects. This systematic literature review (SLR) maps the formal foundations of programming paradigms. Our objective is twofold: (1) to assess the state of the art of classification formalisms and their limitations, and (2) to identify the conceptual primitives and mathematical frameworks for a more powerful, reconstructive approach. Based on a synthesis of 74 primary studies, we find that existing taxonomies lack conceptual granularity, a unified formal basis, and struggle with hybrid languages. In response, our analysis reveals a strong convergence toward a compositional reconstruction of paradigms. This approach identifies a minimal set of orthogonal, atomic primitives and leverages mathematical frameworks, predominantly Type theory, Category theory and Unifying Theories of Programming (UTP), to formally guarantee their compositional properties. We conclude that the literature reflects a significant intellectual shift away from classification towards these promising formal, reconstructive frameworks. This review provides a map of this evolution and proposes a research agenda for their unification.","DOI":"10.48550/arXiv.2508.00534","note":"arXiv:2508.00534 [cs.PL]","number":"arXiv:2508.00534","publisher":"arXiv","source":"arXiv.org","title":"Towards a unified framework for programming paradigms: A systematic review of classification formalisms and methodological foundations","title-short":"Towards a unified framework for programming paradigms","URL":"http://arxiv.org/abs/2508.00534","author":[{"family":"Vandeloise","given":"Mikel"}],"accessed":{"date-parts":[["2026",9,11]]},"issued":{"date-parts":[["2025",8,1]]}},"locator":"3","label":"page"}],"schema":"https://github.com/citation-style-language/schema/raw/master/csl-citation.json"} </w:instrText>
-      </w:r>
-      <w:r>
-        <w:fldChar w:fldCharType="separate"/>
-      </w:r>
-      <w:r>
-        <w:t>(Vandeloise, 2025, p. 3)</w:t>
-      </w:r>
-      <w:r>
-        <w:fldChar w:fldCharType="end"/>
-      </w:r>
-      <w:r>
-        <w:t xml:space="preserve"> .</w:t>
-      </w:r>
-    </w:p>
-    <w:p>
-      <w:pPr>
-        <w:pStyle w:val="Heading4"/>
-      </w:pPr>
-      <w:r>
-        <w:t>Declarative Paradig</w:t>
-      </w:r>
-      <w:r>
-        <w:t xml:space="preserve">m: </w:t>
-      </w:r>
-    </w:p>
-    <w:p/>
-    <w:p>
-      <w:r>
-        <w:rPr>
-          <w:noProof/>
-        </w:rPr>
         <w:drawing>
-          <wp:inline distT="0" distB="0" distL="0" distR="0" wp14:anchorId="37199947" wp14:editId="268EA2B4">
+          <wp:inline distT="0" distB="0" distL="0" distR="0" wp14:anchorId="37199947" wp14:editId="5D42BA77">
             <wp:extent cx="3089910" cy="1544955"/>
             <wp:effectExtent l="0" t="0" r="0" b="0"/>
             <wp:docPr id="554974072" name="Picture 2" descr="The image illustrates a comparison of different programming paradigms, including imperative, declarative, procedural, logic, object-oriented, functional, parallel processing, and database processing.&#10;&#10;AI-generated content may be incorrect."/>
@@ -560,7 +647,7 @@
                     <pic:cNvPicPr/>
                   </pic:nvPicPr>
                   <pic:blipFill>
-                    <a:blip r:embed="rId9" cstate="print">
+                    <a:blip r:embed="rId14" cstate="print">
                       <a:extLst>
                         <a:ext uri="{28A0092B-C50C-407E-A947-70E740481C1C}">
                           <a14:useLocalDpi xmlns:a14="http://schemas.microsoft.com/office/drawing/2010/main" val="0"/>
@@ -662,6 +749,9 @@
       </w:r>
     </w:p>
     <w:p>
+      <w:pPr>
+        <w:ind w:firstLine="0pt"/>
+      </w:pPr>
       <w:r>
         <w:rPr>
           <w:lang w:val="en-IE"/>
@@ -704,6 +794,7 @@
     <w:p/>
     <w:p>
       <w:pPr>
+        <w:ind w:firstLine="0pt"/>
         <w:rPr>
           <w:lang w:val="en-IE"/>
         </w:rPr>
@@ -760,7 +851,7 @@
           <w:noProof/>
         </w:rPr>
         <w:drawing>
-          <wp:inline distT="0" distB="0" distL="0" distR="0" wp14:anchorId="0C31C9A5" wp14:editId="6C0C1500">
+          <wp:inline distT="0" distB="0" distL="0" distR="0" wp14:anchorId="0C31C9A5" wp14:editId="30E506CD">
             <wp:extent cx="3089910" cy="1544955"/>
             <wp:effectExtent l="0" t="0" r="0" b="0"/>
             <wp:docPr id="800503101" name="Picture 6" descr="The image illustrates the various components of the Hadoop Ecosystem, including YARN, Zookeeper, Oozie, Hive, Pig, Solr, Lucene, MapReduce, Spark, Mahout, MLlib, and HDFS, each representing different aspects of data management, processing, and storage.&#10;&#10;AI-generated content may be incorrect."/>
@@ -775,7 +866,7 @@
                     <pic:cNvPicPr/>
                   </pic:nvPicPr>
                   <pic:blipFill>
-                    <a:blip r:embed="rId10" cstate="print">
+                    <a:blip r:embed="rId15" cstate="print">
                       <a:extLst>
                         <a:ext uri="{28A0092B-C50C-407E-A947-70E740481C1C}">
                           <a14:useLocalDpi xmlns:a14="http://schemas.microsoft.com/office/drawing/2010/main" val="0"/>
@@ -853,7 +944,7 @@
                     <pic:cNvPicPr/>
                   </pic:nvPicPr>
                   <pic:blipFill>
-                    <a:blip r:embed="rId11" cstate="print">
+                    <a:blip r:embed="rId16" cstate="print">
                       <a:extLst>
                         <a:ext uri="{28A0092B-C50C-407E-A947-70E740481C1C}">
                           <a14:useLocalDpi xmlns:a14="http://schemas.microsoft.com/office/drawing/2010/main" val="0"/>
@@ -895,7 +986,7 @@
           <w:sz w:val="16"/>
           <w:szCs w:val="16"/>
         </w:rPr>
-        <w:t>Fig. 3. Hadoop distributed architecture with master and worker nodes.</w:t>
+        <w:t>Fig. 3. Hadoop distributed architecture with worker nodes.</w:t>
       </w:r>
     </w:p>
     <w:p>
@@ -933,7 +1024,7 @@
                     <pic:cNvPicPr/>
                   </pic:nvPicPr>
                   <pic:blipFill>
-                    <a:blip r:embed="rId12" cstate="print">
+                    <a:blip r:embed="rId17" cstate="print">
                       <a:extLst>
                         <a:ext uri="{28A0092B-C50C-407E-A947-70E740481C1C}">
                           <a14:useLocalDpi xmlns:a14="http://schemas.microsoft.com/office/drawing/2010/main" val="0"/>
@@ -989,19 +1080,20 @@
     </w:p>
     <w:p>
       <w:pPr>
+        <w:pStyle w:val="Heading1"/>
+      </w:pPr>
+      <w:r>
+        <w:t>METHODOLOGY</w:t>
+      </w:r>
+    </w:p>
+    <w:p>
+      <w:pPr>
         <w:rPr>
           <w:kern w:val="2"/>
           <w:lang w:val="en-IE" w:eastAsia="en-IE"/>
           <w14:ligatures w14:val="standardContextual"/>
         </w:rPr>
       </w:pPr>
-      <w:r>
-        <w:rPr>
-          <w:b/>
-          <w:bCs/>
-        </w:rPr>
-        <w:t>III. METHODOLOGY</w:t>
-      </w:r>
     </w:p>
     <w:p>
       <w:pPr>
@@ -1014,31 +1106,30 @@
         <w:rPr>
           <w:lang w:val="en-IE"/>
         </w:rPr>
-        <w:lastRenderedPageBreak/>
         <w:t>Data architecture and distributed infrastructure</w:t>
       </w:r>
     </w:p>
     <w:p>
       <w:pPr>
+        <w:pStyle w:val="Heading4"/>
+      </w:pPr>
+      <w:r>
+        <w:t>Large-scale storage: Apache Hadoop was used as an open-source framework to store data in the Hadoop Distributed File System (HDFS). Its main advantages are high fault tolerance and broad compatibility.</w:t>
+      </w:r>
+    </w:p>
+    <w:p>
+      <w:pPr>
+        <w:ind w:firstLine="0pt"/>
         <w:rPr>
           <w:kern w:val="2"/>
           <w:lang w:val="en-IE" w:eastAsia="en-IE"/>
           <w14:ligatures w14:val="standardContextual"/>
         </w:rPr>
       </w:pPr>
-      <w:r>
-        <w:rPr>
-          <w:i/>
-          <w:iCs/>
-        </w:rPr>
-        <w:t>a) Large-scale storage:</w:t>
-      </w:r>
-      <w:r>
-        <w:t xml:space="preserve"> Apache Hadoop was used as an open-source framework to store data in the Hadoop Distributed File System (HDFS). Its main advantages are high fault tolerance and broad compatibility.</w:t>
-      </w:r>
-    </w:p>
-    <w:p>
-      <w:pPr>
+    </w:p>
+    <w:p>
+      <w:pPr>
+        <w:ind w:firstLine="0pt"/>
         <w:rPr>
           <w:kern w:val="2"/>
           <w:lang w:val="en-IE" w:eastAsia="en-IE"/>
@@ -1078,6 +1169,7 @@
     </w:p>
     <w:p>
       <w:pPr>
+        <w:ind w:firstLine="0pt"/>
         <w:rPr>
           <w:lang w:val="en-IE"/>
         </w:rPr>
@@ -1085,6 +1177,7 @@
     </w:p>
     <w:p>
       <w:pPr>
+        <w:ind w:firstLine="0pt"/>
         <w:rPr>
           <w:kern w:val="2"/>
           <w:lang w:val="en-IE" w:eastAsia="en-IE"/>
@@ -1103,36 +1196,52 @@
     </w:p>
     <w:p>
       <w:pPr>
+        <w:ind w:firstLine="0pt"/>
+      </w:pPr>
+      <w:r>
+        <w:t xml:space="preserve"> </w:t>
+      </w:r>
+    </w:p>
+    <w:p>
+      <w:pPr>
+        <w:ind w:firstLine="0pt"/>
+      </w:pPr>
+      <w:r>
+        <w:t>A total of 70,000 images were processed and used for training. They were divided into ten classes: aeroplane, automobile, bird, cat, deer, dog, frog, horse, ship and truck. The training set contained 60,000 images (85.70%), while the test set contained 10,000 images (14.30%). The images were loaded from the CIFAR-10 dataset through Keras. After loading, the image arrays were reshaped to 32 × 32 pixels to improve classification accuracy. Separate variables were created for training and testing, and ten classes were assigned to each set. The model was then trained through several sequential layers with specific filters and parameters. These settings were adjusted during processing to improve efficiency and reduce resource use.</w:t>
+      </w:r>
+    </w:p>
+    <w:p/>
+    <w:p/>
+    <w:p>
+      <w:pPr>
         <w:rPr>
           <w:kern w:val="2"/>
           <w:lang w:val="en-IE" w:eastAsia="en-IE"/>
           <w14:ligatures w14:val="standardContextual"/>
         </w:rPr>
       </w:pPr>
-      <w:r>
-        <w:t>A total of 70,000 images were processed and used for training. They were divided into ten classes: aeroplane, automobile, bird, cat, deer, dog, frog, horse, ship and truck. The training set contained 60,000 images (85.70%), while the test set contained 10,000 images (14.30%). The images were loaded from the CIFAR-10 dataset through Keras. After loading, the image arrays were reshaped to 32 × 32 pixels to improve classification accuracy. Separate variables were created for training and testing, and ten classes were assigned to each set. The model was then trained through several sequential layers with specific filters and parameters. These settings were adjusted during processing to improve efficiency and reduce resource use.</w:t>
-      </w:r>
-    </w:p>
-    <w:p>
-      <w:pPr>
+    </w:p>
+    <w:p>
+      <w:pPr>
+        <w:pStyle w:val="Heading2"/>
+      </w:pPr>
+      <w:r>
+        <w:t>Dataset preprocessing</w:t>
+      </w:r>
+    </w:p>
+    <w:p>
+      <w:pPr>
+        <w:ind w:firstLine="0pt"/>
         <w:rPr>
           <w:kern w:val="2"/>
           <w:lang w:val="en-IE" w:eastAsia="en-IE"/>
           <w14:ligatures w14:val="standardContextual"/>
         </w:rPr>
       </w:pPr>
-      <w:r>
-        <w:rPr>
-          <w:b/>
-          <w:bCs/>
-          <w:i/>
-          <w:iCs/>
-        </w:rPr>
-        <w:t>F. Dataset preprocessing</w:t>
-      </w:r>
-    </w:p>
-    <w:p>
-      <w:pPr>
+    </w:p>
+    <w:p>
+      <w:pPr>
+        <w:ind w:firstLine="0pt"/>
         <w:rPr>
           <w:kern w:val="2"/>
           <w:lang w:val="en-IE" w:eastAsia="en-IE"/>
@@ -1152,24 +1261,24 @@
     </w:p>
     <w:p>
       <w:pPr>
+        <w:pStyle w:val="Heading2"/>
+      </w:pPr>
+      <w:r>
+        <w:t>Application of programming paradigms</w:t>
+      </w:r>
+    </w:p>
+    <w:p>
+      <w:pPr>
         <w:rPr>
           <w:kern w:val="2"/>
           <w:lang w:val="en-IE" w:eastAsia="en-IE"/>
           <w14:ligatures w14:val="standardContextual"/>
         </w:rPr>
       </w:pPr>
-      <w:r>
-        <w:rPr>
-          <w:b/>
-          <w:bCs/>
-          <w:i/>
-          <w:iCs/>
-        </w:rPr>
-        <w:t>G. Application of programming paradigms</w:t>
-      </w:r>
-    </w:p>
-    <w:p>
-      <w:pPr>
+    </w:p>
+    <w:p>
+      <w:pPr>
+        <w:ind w:firstLine="0pt"/>
         <w:rPr>
           <w:i/>
           <w:iCs/>
@@ -1334,7 +1443,7 @@
       </w:tblPr>
       <w:tblGrid>
         <w:gridCol w:w="1721"/>
-        <w:gridCol w:w="1977"/>
+        <w:gridCol w:w="3018"/>
       </w:tblGrid>
       <w:tr>
         <w:tc>
@@ -1385,7 +1494,6 @@
               <w:rPr>
                 <w:lang w:val="es-US"/>
               </w:rPr>
-              <w:lastRenderedPageBreak/>
               <w:t>Activation Type</w:t>
             </w:r>
           </w:p>
@@ -1927,9 +2035,9 @@
         <w:tblLook w:firstRow="1" w:lastRow="0" w:firstColumn="1" w:lastColumn="0" w:noHBand="0" w:noVBand="1"/>
       </w:tblPr>
       <w:tblGrid>
-        <w:gridCol w:w="921"/>
-        <w:gridCol w:w="1377"/>
-        <w:gridCol w:w="1400"/>
+        <w:gridCol w:w="1249"/>
+        <w:gridCol w:w="1730"/>
+        <w:gridCol w:w="1760"/>
       </w:tblGrid>
       <w:tr>
         <w:tc>
@@ -2480,6 +2588,7 @@
           <w:noProof/>
           <w:lang w:val="es-US"/>
         </w:rPr>
+        <w:lastRenderedPageBreak/>
         <w:drawing>
           <wp:inline distT="0" distB="0" distL="0" distR="0" wp14:anchorId="488A2651" wp14:editId="0B53E5F2">
             <wp:extent cx="3086100" cy="1776730"/>
@@ -2498,7 +2607,7 @@
                     </pic:cNvPicPr>
                   </pic:nvPicPr>
                   <pic:blipFill>
-                    <a:blip r:embed="rId13" cstate="print">
+                    <a:blip r:embed="rId18" cstate="print">
                       <a:extLst>
                         <a:ext uri="{28A0092B-C50C-407E-A947-70E740481C1C}">
                           <a14:useLocalDpi xmlns:a14="http://schemas.microsoft.com/office/drawing/2010/main" val="0"/>
@@ -2578,7 +2687,7 @@
                     </pic:cNvPicPr>
                   </pic:nvPicPr>
                   <pic:blipFill>
-                    <a:blip r:embed="rId14" cstate="print">
+                    <a:blip r:embed="rId19" cstate="print">
                       <a:extLst>
                         <a:ext uri="{28A0092B-C50C-407E-A947-70E740481C1C}">
                           <a14:useLocalDpi xmlns:a14="http://schemas.microsoft.com/office/drawing/2010/main" val="0"/>
@@ -2637,7 +2746,7 @@
       </w:tblPr>
       <w:tblGrid>
         <w:gridCol w:w="1721"/>
-        <w:gridCol w:w="1977"/>
+        <w:gridCol w:w="3018"/>
       </w:tblGrid>
       <w:tr>
         <w:tc>
@@ -3212,9 +3321,9 @@
         <w:tblLook w:firstRow="1" w:lastRow="0" w:firstColumn="1" w:lastColumn="0" w:noHBand="0" w:noVBand="1"/>
       </w:tblPr>
       <w:tblGrid>
-        <w:gridCol w:w="1067"/>
-        <w:gridCol w:w="1617"/>
-        <w:gridCol w:w="1014"/>
+        <w:gridCol w:w="1510"/>
+        <w:gridCol w:w="1730"/>
+        <w:gridCol w:w="1499"/>
       </w:tblGrid>
       <w:tr>
         <w:tc>
@@ -3770,7 +3879,7 @@
                     </pic:cNvPicPr>
                   </pic:nvPicPr>
                   <pic:blipFill>
-                    <a:blip r:embed="rId15" cstate="print">
+                    <a:blip r:embed="rId20" cstate="print">
                       <a:extLst>
                         <a:ext uri="{28A0092B-C50C-407E-A947-70E740481C1C}">
                           <a14:useLocalDpi xmlns:a14="http://schemas.microsoft.com/office/drawing/2010/main" val="0"/>
@@ -3844,7 +3953,7 @@
                     </pic:cNvPicPr>
                   </pic:nvPicPr>
                   <pic:blipFill>
-                    <a:blip r:embed="rId16" cstate="print">
+                    <a:blip r:embed="rId21" cstate="print">
                       <a:extLst>
                         <a:ext uri="{28A0092B-C50C-407E-A947-70E740481C1C}">
                           <a14:useLocalDpi xmlns:a14="http://schemas.microsoft.com/office/drawing/2010/main" val="0"/>
@@ -3903,7 +4012,7 @@
       </w:tblPr>
       <w:tblGrid>
         <w:gridCol w:w="1721"/>
-        <w:gridCol w:w="1977"/>
+        <w:gridCol w:w="3018"/>
       </w:tblGrid>
       <w:tr>
         <w:tc>
@@ -4396,9 +4505,9 @@
         <w:tblLook w:firstRow="1" w:lastRow="0" w:firstColumn="1" w:lastColumn="0" w:noHBand="0" w:noVBand="1"/>
       </w:tblPr>
       <w:tblGrid>
-        <w:gridCol w:w="1045"/>
-        <w:gridCol w:w="1581"/>
-        <w:gridCol w:w="1072"/>
+        <w:gridCol w:w="1500"/>
+        <w:gridCol w:w="1730"/>
+        <w:gridCol w:w="1509"/>
       </w:tblGrid>
       <w:tr>
         <w:tc>
@@ -5060,7 +5169,7 @@
                     </pic:cNvPicPr>
                   </pic:nvPicPr>
                   <pic:blipFill>
-                    <a:blip r:embed="rId17" cstate="print">
+                    <a:blip r:embed="rId22" cstate="print">
                       <a:extLst>
                         <a:ext uri="{28A0092B-C50C-407E-A947-70E740481C1C}">
                           <a14:useLocalDpi xmlns:a14="http://schemas.microsoft.com/office/drawing/2010/main" val="0"/>
@@ -5134,7 +5243,7 @@
                     </pic:cNvPicPr>
                   </pic:nvPicPr>
                   <pic:blipFill>
-                    <a:blip r:embed="rId18" cstate="print">
+                    <a:blip r:embed="rId23" cstate="print">
                       <a:extLst>
                         <a:ext uri="{28A0092B-C50C-407E-A947-70E740481C1C}">
                           <a14:useLocalDpi xmlns:a14="http://schemas.microsoft.com/office/drawing/2010/main" val="0"/>
@@ -5193,7 +5302,7 @@
       </w:tblPr>
       <w:tblGrid>
         <w:gridCol w:w="1721"/>
-        <w:gridCol w:w="1977"/>
+        <w:gridCol w:w="3018"/>
       </w:tblGrid>
       <w:tr>
         <w:tc>
@@ -5792,9 +5901,9 @@
         <w:tblLook w:firstRow="1" w:lastRow="0" w:firstColumn="1" w:lastColumn="0" w:noHBand="0" w:noVBand="1"/>
       </w:tblPr>
       <w:tblGrid>
-        <w:gridCol w:w="1056"/>
-        <w:gridCol w:w="1599"/>
-        <w:gridCol w:w="1043"/>
+        <w:gridCol w:w="1506"/>
+        <w:gridCol w:w="1730"/>
+        <w:gridCol w:w="1503"/>
       </w:tblGrid>
       <w:tr>
         <w:tc>
@@ -6362,7 +6471,6 @@
         <w:rPr>
           <w:noProof/>
         </w:rPr>
-        <w:lastRenderedPageBreak/>
         <w:drawing>
           <wp:inline distT="0" distB="0" distL="0" distR="0" wp14:anchorId="15337AE3" wp14:editId="2E324425">
             <wp:extent cx="3089910" cy="1577975"/>
@@ -6381,7 +6489,7 @@
                     </pic:cNvPicPr>
                   </pic:nvPicPr>
                   <pic:blipFill>
-                    <a:blip r:embed="rId19" cstate="print">
+                    <a:blip r:embed="rId24" cstate="print">
                       <a:extLst>
                         <a:ext uri="{28A0092B-C50C-407E-A947-70E740481C1C}">
                           <a14:useLocalDpi xmlns:a14="http://schemas.microsoft.com/office/drawing/2010/main" val="0"/>
@@ -6437,6 +6545,7 @@
         <w:rPr>
           <w:noProof/>
         </w:rPr>
+        <w:lastRenderedPageBreak/>
         <w:drawing>
           <wp:inline distT="0" distB="0" distL="0" distR="0" wp14:anchorId="4028057A" wp14:editId="349A8A3C">
             <wp:extent cx="3089910" cy="1298575"/>
@@ -6455,7 +6564,7 @@
                     </pic:cNvPicPr>
                   </pic:nvPicPr>
                   <pic:blipFill>
-                    <a:blip r:embed="rId20" cstate="print">
+                    <a:blip r:embed="rId25" cstate="print">
                       <a:extLst>
                         <a:ext uri="{28A0092B-C50C-407E-A947-70E740481C1C}">
                           <a14:useLocalDpi xmlns:a14="http://schemas.microsoft.com/office/drawing/2010/main" val="0"/>
@@ -6490,6 +6599,37 @@
     <w:p>
       <w:pPr>
         <w:rPr>
+          <w:sz w:val="16"/>
+          <w:szCs w:val="16"/>
+        </w:rPr>
+      </w:pPr>
+      <w:r>
+        <w:rPr>
+          <w:sz w:val="16"/>
+          <w:szCs w:val="16"/>
+        </w:rPr>
+        <w:t xml:space="preserve">Fig. 12. Training and validation accuracy and loss with Leaky </w:t>
+      </w:r>
+      <w:proofErr w:type="spellStart"/>
+      <w:r>
+        <w:rPr>
+          <w:sz w:val="16"/>
+          <w:szCs w:val="16"/>
+        </w:rPr>
+        <w:t>ReLU</w:t>
+      </w:r>
+      <w:proofErr w:type="spellEnd"/>
+      <w:r>
+        <w:rPr>
+          <w:sz w:val="16"/>
+          <w:szCs w:val="16"/>
+        </w:rPr>
+        <w:t>.</w:t>
+      </w:r>
+    </w:p>
+    <w:p>
+      <w:pPr>
+        <w:rPr>
           <w:kern w:val="2"/>
           <w:sz w:val="16"/>
           <w:szCs w:val="16"/>
@@ -6497,79 +6637,24 @@
           <w14:ligatures w14:val="standardContextual"/>
         </w:rPr>
       </w:pPr>
-      <w:r>
-        <w:rPr>
-          <w:sz w:val="16"/>
-          <w:szCs w:val="16"/>
-        </w:rPr>
-        <w:t>Fig. 12. Training and validation accuracy and loss with Leaky ReLU.</w:t>
-      </w:r>
-    </w:p>
-    <w:p>
-      <w:r>
-        <w:rPr>
-          <w:b/>
-          <w:bCs/>
-        </w:rPr>
-        <w:t>IV. CRITICAL EVALUATION</w:t>
-      </w:r>
-    </w:p>
-    <w:p>
-      <w:pPr>
-        <w:rPr>
-          <w:kern w:val="2"/>
-          <w:lang w:val="en-IE" w:eastAsia="en-IE"/>
-          <w14:ligatures w14:val="standardContextual"/>
-        </w:rPr>
-      </w:pPr>
-      <w:r>
+    </w:p>
+    <w:p>
+      <w:pPr>
+        <w:pStyle w:val="Heading1"/>
+      </w:pPr>
+      <w:r>
+        <w:t>CRITICAL EVALUATION</w:t>
+      </w:r>
+    </w:p>
+    <w:p/>
+    <w:p>
+      <w:pPr>
         <w:rPr>
           <w:b/>
           <w:bCs/>
           <w:i/>
           <w:iCs/>
         </w:rPr>
-        <w:t>A. Key findings</w:t>
-      </w:r>
-    </w:p>
-    <w:p>
-      <w:pPr>
-        <w:rPr>
-          <w:kern w:val="2"/>
-          <w:lang w:val="en-IE" w:eastAsia="en-IE"/>
-          <w14:ligatures w14:val="standardContextual"/>
-        </w:rPr>
-      </w:pPr>
-      <w:r>
-        <w:t>a) According to the results, Leaky ReLU produced the best performance. It achieved the highest test accuracy, at 79.60%, and the shortest training time, at 61.88 minutes. In contrast, sigmoid achieved an accuracy of only 10.00% and required the longest computing time, at 346.02 minutes. ReLU and tanh also produced suitable results, with test accuracies of 77.80% and 74.10%, respectively.</w:t>
-      </w:r>
-    </w:p>
-    <w:p>
-      <w:pPr>
-        <w:rPr>
-          <w:kern w:val="2"/>
-          <w:lang w:val="en-IE" w:eastAsia="en-IE"/>
-          <w14:ligatures w14:val="standardContextual"/>
-        </w:rPr>
-      </w:pPr>
-      <w:r>
-        <w:t>b) Apache Hadoop stored more than 200,000 records efficiently. When Apache Spark was used for distributed processing, no important delays were observed during data cleaning and filtering with PySpark.</w:t>
-      </w:r>
-    </w:p>
-    <w:p>
-      <w:pPr>
-        <w:rPr>
-          <w:lang w:val="en-IE"/>
-        </w:rPr>
-      </w:pPr>
-    </w:p>
-    <w:p>
-      <w:pPr>
-        <w:rPr>
-          <w:kern w:val="2"/>
-          <w:lang w:val="en-IE" w:eastAsia="en-IE"/>
-          <w14:ligatures w14:val="standardContextual"/>
-        </w:rPr>
       </w:pPr>
       <w:r>
         <w:rPr>
@@ -6578,68 +6663,8 @@
           <w:i/>
           <w:iCs/>
         </w:rPr>
-        <w:t>B. Implications</w:t>
-      </w:r>
-    </w:p>
-    <w:p>
-      <w:pPr>
-        <w:rPr>
-          <w:kern w:val="2"/>
-          <w:lang w:val="en-IE" w:eastAsia="en-IE"/>
-          <w14:ligatures w14:val="standardContextual"/>
-        </w:rPr>
-      </w:pPr>
-      <w:r>
-        <w:t>a) The convolutional neural network architecture supported efficient image classification. The use of Leaky ReLU reduced the computing time and achieved higher accuracy when classifying and predicting the different image classes.</w:t>
-      </w:r>
-    </w:p>
-    <w:p>
-      <w:pPr>
-        <w:rPr>
-          <w:kern w:val="2"/>
-          <w:lang w:val="en-IE" w:eastAsia="en-IE"/>
-          <w14:ligatures w14:val="standardContextual"/>
-        </w:rPr>
-      </w:pPr>
-      <w:r>
-        <w:t xml:space="preserve">b) Hadoop HDFS provides fault-tolerant storage that can scale at a reasonable cost and reduces the need for local disk storage. Distributed processing with PySpark can reduce the execution time of data-preprocessing pipelines. Spark SQL queries use the declarative paradigm, while large-scale record operations such as </w:t>
-      </w:r>
-      <w:r>
-        <w:rPr>
-          <w:i/>
-          <w:iCs/>
-        </w:rPr>
-        <w:t>map</w:t>
-      </w:r>
-      <w:r>
-        <w:t xml:space="preserve"> and </w:t>
-      </w:r>
-      <w:r>
-        <w:rPr>
-          <w:i/>
-          <w:iCs/>
-        </w:rPr>
-        <w:t>filter</w:t>
-      </w:r>
-      <w:r>
-        <w:t xml:space="preserve"> use the functional paradigm.</w:t>
-      </w:r>
-    </w:p>
-    <w:p>
-      <w:pPr>
-        <w:rPr>
-          <w:lang w:val="en-IE"/>
-        </w:rPr>
-      </w:pPr>
-    </w:p>
-    <w:p>
-      <w:pPr>
-        <w:rPr>
-          <w:kern w:val="2"/>
-          <w:lang w:val="en-IE" w:eastAsia="en-IE"/>
-          <w14:ligatures w14:val="standardContextual"/>
-        </w:rPr>
-      </w:pPr>
+        <w:t>A. Key findings</w:t>
+      </w:r>
       <w:r>
         <w:rPr>
           <w:b/>
@@ -6647,8 +6672,18 @@
           <w:i/>
           <w:iCs/>
         </w:rPr>
-        <w:t>C. Limitations</w:t>
-      </w:r>
+        <w:t xml:space="preserve"> </w:t>
+      </w:r>
+    </w:p>
+    <w:p>
+      <w:pPr>
+        <w:rPr>
+          <w:b/>
+          <w:bCs/>
+          <w:i/>
+          <w:iCs/>
+        </w:rPr>
+      </w:pPr>
     </w:p>
     <w:p>
       <w:pPr>
@@ -6659,7 +6694,7 @@
         </w:rPr>
       </w:pPr>
       <w:r>
-        <w:t>a) The tests used a low-resolution image dataset of 32 × 32 × 3 pixels. The results were acceptable, but higher-resolution images could produce different outcomes. To prioritise performance and processing time, training was limited to 15 epochs for the dataset of 60,000 images.</w:t>
+        <w:t>a) According to the results, Leaky ReLU produced the best performance. It achieved the highest test accuracy, at 79.60%, and the shortest training time, at 61.88 minutes. In contrast, sigmoid achieved an accuracy of only 10.00% and required the longest computing time, at 346.02 minutes. ReLU and tanh also produced suitable results, with test accuracies of 77.80% and 74.10%, respectively.</w:t>
       </w:r>
     </w:p>
     <w:p>
@@ -6671,6 +6706,132 @@
         </w:rPr>
       </w:pPr>
       <w:r>
+        <w:t>b) Apache Hadoop stored more than 200,000 records efficiently. When Apache Spark was used for distributed processing, no important delays were observed during data cleaning and filtering with PySpark.</w:t>
+      </w:r>
+    </w:p>
+    <w:p>
+      <w:pPr>
+        <w:rPr>
+          <w:lang w:val="en-IE"/>
+        </w:rPr>
+      </w:pPr>
+    </w:p>
+    <w:p>
+      <w:pPr>
+        <w:rPr>
+          <w:kern w:val="2"/>
+          <w:lang w:val="en-IE" w:eastAsia="en-IE"/>
+          <w14:ligatures w14:val="standardContextual"/>
+        </w:rPr>
+      </w:pPr>
+      <w:r>
+        <w:rPr>
+          <w:b/>
+          <w:bCs/>
+          <w:i/>
+          <w:iCs/>
+        </w:rPr>
+        <w:t>B. Implications</w:t>
+      </w:r>
+    </w:p>
+    <w:p>
+      <w:pPr>
+        <w:rPr>
+          <w:kern w:val="2"/>
+          <w:lang w:val="en-IE" w:eastAsia="en-IE"/>
+          <w14:ligatures w14:val="standardContextual"/>
+        </w:rPr>
+      </w:pPr>
+      <w:r>
+        <w:t>a) The convolutional neural network architecture supported efficient image classification. The use of Leaky ReLU reduced the computing time and achieved higher accuracy when classifying and predicting the different image classes.</w:t>
+      </w:r>
+    </w:p>
+    <w:p>
+      <w:pPr>
+        <w:rPr>
+          <w:kern w:val="2"/>
+          <w:lang w:val="en-IE" w:eastAsia="en-IE"/>
+          <w14:ligatures w14:val="standardContextual"/>
+        </w:rPr>
+      </w:pPr>
+      <w:r>
+        <w:t xml:space="preserve">b) Hadoop HDFS provides fault-tolerant storage that can scale at a reasonable cost and reduces the need for local disk storage. Distributed processing with PySpark can reduce the execution time of data-preprocessing pipelines. Spark SQL queries use the declarative paradigm, while large-scale record operations such as </w:t>
+      </w:r>
+      <w:r>
+        <w:rPr>
+          <w:i/>
+          <w:iCs/>
+        </w:rPr>
+        <w:t>map</w:t>
+      </w:r>
+      <w:r>
+        <w:t xml:space="preserve"> and </w:t>
+      </w:r>
+      <w:r>
+        <w:rPr>
+          <w:i/>
+          <w:iCs/>
+        </w:rPr>
+        <w:t>filter</w:t>
+      </w:r>
+      <w:r>
+        <w:t xml:space="preserve"> use the functional paradigm.</w:t>
+      </w:r>
+    </w:p>
+    <w:p>
+      <w:pPr>
+        <w:rPr>
+          <w:lang w:val="en-IE"/>
+        </w:rPr>
+      </w:pPr>
+    </w:p>
+    <w:p>
+      <w:pPr>
+        <w:rPr>
+          <w:b/>
+          <w:bCs/>
+          <w:i/>
+          <w:iCs/>
+        </w:rPr>
+      </w:pPr>
+      <w:r>
+        <w:rPr>
+          <w:b/>
+          <w:bCs/>
+          <w:i/>
+          <w:iCs/>
+        </w:rPr>
+        <w:t>C. Limitations</w:t>
+      </w:r>
+    </w:p>
+    <w:p>
+      <w:pPr>
+        <w:rPr>
+          <w:kern w:val="2"/>
+          <w:lang w:val="en-IE" w:eastAsia="en-IE"/>
+          <w14:ligatures w14:val="standardContextual"/>
+        </w:rPr>
+      </w:pPr>
+    </w:p>
+    <w:p>
+      <w:pPr>
+        <w:pStyle w:val="Heading4"/>
+      </w:pPr>
+      <w:r>
+        <w:t>The tests used a low-resolution image dataset of 32 × 32 × 3 pixels. The results were acceptable, but higher-resolution images could produce different outcomes. To prioritise performance and processing time, training was limited to 15 epochs for the dataset of 60,000 images.</w:t>
+      </w:r>
+    </w:p>
+    <w:p>
+      <w:pPr>
+        <w:rPr>
+          <w:kern w:val="2"/>
+          <w:lang w:val="en-IE" w:eastAsia="en-IE"/>
+          <w14:ligatures w14:val="standardContextual"/>
+        </w:rPr>
+      </w:pPr>
+    </w:p>
+    <w:p>
+      <w:pPr>
         <w:rPr>
           <w:b/>
           <w:bCs/>
@@ -6678,28 +6839,6 @@
           <w:iCs/>
           <w:lang w:val="en-IE"/>
         </w:rPr>
-        <w:t>D. Point of contradiction</w:t>
-      </w:r>
-    </w:p>
-    <w:p>
-      <w:pPr>
-        <w:rPr>
-          <w:kern w:val="2"/>
-          <w:lang w:val="en-IE" w:eastAsia="en-IE"/>
-          <w14:ligatures w14:val="standardContextual"/>
-        </w:rPr>
-      </w:pPr>
-      <w:r>
-        <w:t>Different datasets were required for CNN image training and for data storage with Hadoop and Spark. Implementing image classification directly with PySpark was more difficult because of the complexity of the code and frequent errors in the Ubuntu virtual machine when Jupyter Notebook was running.</w:t>
-      </w:r>
-    </w:p>
-    <w:p>
-      <w:pPr>
-        <w:rPr>
-          <w:kern w:val="2"/>
-          <w:lang w:val="en-IE" w:eastAsia="en-IE"/>
-          <w14:ligatures w14:val="standardContextual"/>
-        </w:rPr>
       </w:pPr>
       <w:r>
         <w:rPr>
@@ -6707,8 +6846,9 @@
           <w:bCs/>
           <w:i/>
           <w:iCs/>
-        </w:rPr>
-        <w:t>E. Research gap</w:t>
+          <w:lang w:val="en-IE"/>
+        </w:rPr>
+        <w:t>D. Point of contradiction</w:t>
       </w:r>
     </w:p>
     <w:p>
@@ -6719,15 +6859,14 @@
           <w14:ligatures w14:val="standardContextual"/>
         </w:rPr>
       </w:pPr>
-      <w:r>
-        <w:t>a) Further research should examine the implementation of a convolutional neural network architecture in a virtual machine.</w:t>
-      </w:r>
-    </w:p>
-    <w:p>
-      <w:r>
-        <w:t>Programming-paradigm concepts should also be applied and evaluated with PySpark.</w:t>
-      </w:r>
-    </w:p>
+    </w:p>
+    <w:p>
+      <w:r>
+        <w:t>Different datasets were required for CNN image training and for data storage with Hadoop and Spark. Implementing image classification directly with PySpark was more difficult because of the complexity of the code and frequent errors in the Ubuntu virtual machine when Jupyter Notebook was running.</w:t>
+      </w:r>
+    </w:p>
+    <w:p/>
+    <w:p/>
     <w:p>
       <w:pPr>
         <w:rPr>
@@ -6736,8 +6875,24 @@
           <w14:ligatures w14:val="standardContextual"/>
         </w:rPr>
       </w:pPr>
-      <w:r>
-        <w:t>b) Future studies should monitor storage and memory distribution when both low- and high-resolution images are processed.</w:t>
+    </w:p>
+    <w:p>
+      <w:pPr>
+        <w:rPr>
+          <w:b/>
+          <w:bCs/>
+          <w:i/>
+          <w:iCs/>
+        </w:rPr>
+      </w:pPr>
+      <w:r>
+        <w:rPr>
+          <w:b/>
+          <w:bCs/>
+          <w:i/>
+          <w:iCs/>
+        </w:rPr>
+        <w:t>E. Research gap</w:t>
       </w:r>
     </w:p>
     <w:p>
@@ -6748,13 +6903,57 @@
           <w14:ligatures w14:val="standardContextual"/>
         </w:rPr>
       </w:pPr>
-      <w:r>
-        <w:rPr>
-          <w:b/>
-          <w:bCs/>
-        </w:rPr>
-        <w:t>V. CONCLUSIONS</w:t>
-      </w:r>
+    </w:p>
+    <w:p>
+      <w:pPr>
+        <w:rPr>
+          <w:kern w:val="2"/>
+          <w:lang w:val="en-IE" w:eastAsia="en-IE"/>
+          <w14:ligatures w14:val="standardContextual"/>
+        </w:rPr>
+      </w:pPr>
+      <w:r>
+        <w:t>a) Further research should examine the implementation of a convolutional neural network architecture in a virtual machine.</w:t>
+      </w:r>
+    </w:p>
+    <w:p>
+      <w:r>
+        <w:t>Programming-paradigm concepts should also be applied and evaluated with PySpark.</w:t>
+      </w:r>
+    </w:p>
+    <w:p>
+      <w:pPr>
+        <w:pStyle w:val="Heading4"/>
+      </w:pPr>
+      <w:r>
+        <w:t>Future studies should monitor storage and memory distribution when both low- and high-resolution images are processed.</w:t>
+      </w:r>
+    </w:p>
+    <w:p>
+      <w:pPr>
+        <w:rPr>
+          <w:kern w:val="2"/>
+          <w:lang w:eastAsia="en-IE"/>
+          <w14:ligatures w14:val="standardContextual"/>
+        </w:rPr>
+      </w:pPr>
+    </w:p>
+    <w:p>
+      <w:pPr>
+        <w:pStyle w:val="Heading1"/>
+      </w:pPr>
+      <w:r>
+        <w:t>CONCLUSIONS</w:t>
+      </w:r>
+    </w:p>
+    <w:p>
+      <w:pPr>
+        <w:rPr>
+          <w:kern w:val="2"/>
+          <w:lang w:val="en-IE" w:eastAsia="en-IE"/>
+          <w14:ligatures w14:val="standardContextual"/>
+        </w:rPr>
+      </w:pPr>
     </w:p>
     <w:p>
       <w:pPr>
@@ -6765,11 +6964,7 @@
         </w:numPr>
       </w:pPr>
       <w:r>
-        <w:t xml:space="preserve">This study demonstrates that combining programming paradigms is effective for large-scale data processing and image classification. Hadoop HDFS and Apache Spark supported the storage and distributed processing of more than 200,000 records, while procedural, object-oriented, functional, and declarative techniques addressed different stages of data preparation, model construction, and querying. In the CNN experiments, Leaky ReLU achieved the best overall result, with a final test accuracy of 79.60% and the shortest training time of 61.88 minutes. ReLU and tanh also produced viable results, whereas sigmoid failed to converge and remained near random-guess accuracy. These findings indicate that paradigm selection and activation-function choice have a direct effect on scalability, execution time, and predictive performance. Future work should evaluate higher-resolution images, longer training schedules, additional model architectures, and a unified Spark-based </w:t>
-      </w:r>
-      <w:r>
-        <w:lastRenderedPageBreak/>
-        <w:t>pipeline for both distributed storage and model training.</w:t>
+        <w:t>This study demonstrates that combining programming paradigms is effective for large-scale data processing and image classification. Hadoop HDFS and Apache Spark supported the storage and distributed processing of more than 200,000 records, while procedural, object-oriented, functional, and declarative techniques addressed different stages of data preparation, model construction, and querying. In the CNN experiments, Leaky ReLU achieved the best overall result, with a final test accuracy of 79.60% and the shortest training time of 61.88 minutes. ReLU and tanh also produced viable results, whereas sigmoid failed to converge and remained near random-guess accuracy. These findings indicate that paradigm selection and activation-function choice have a direct effect on scalability, execution time, and predictive performance. Future work should evaluate higher-resolution images, longer training schedules, additional model architectures, and a unified Spark-based pipeline for both distributed storage and model training.</w:t>
       </w:r>
     </w:p>
     <w:p>
@@ -7037,6 +7232,7 @@
         <w:pStyle w:val="references"/>
       </w:pPr>
       <w:r>
+        <w:lastRenderedPageBreak/>
         <w:t xml:space="preserve">Sharma, N., Jain, V. and Mishra, A., 2018. An analysis of convolutional neural networks for image classification. </w:t>
       </w:r>
       <w:r>
@@ -7123,7 +7319,7 @@
       <w:r>
         <w:t xml:space="preserve">. 3 June. Available at: </w:t>
       </w:r>
-      <w:hyperlink r:id="rId21" w:tgtFrame="_blank" w:history="1">
+      <w:hyperlink r:id="rId26" w:tgtFrame="_blank" w:history="1">
         <w:r>
           <w:rPr>
             <w:rStyle w:val="Hyperlink"/>
@@ -7251,9 +7447,9 @@
     </w:p>
     <w:sectPr>
       <w:type w:val="continuous"/>
-      <w:pgSz w:w="230.40pt" w:h="1296pt" w:code="9"/>
-      <w:pgMar w:top="0pt" w:right="22.50pt" w:bottom="0pt" w:left="22.50pt" w:header="0pt" w:footer="0pt" w:gutter="0pt"/>
-      <w:cols w:space="35.40pt"/>
+      <w:pgSz w:w="595.30pt" w:h="841.90pt" w:code="9"/>
+      <w:pgMar w:top="54pt" w:right="42.50pt" w:bottom="54pt" w:left="42.50pt" w:header="0pt" w:footer="0pt" w:gutter="0pt"/>
+      <w:cols w:num="2" w:space="35.40pt"/>
       <w:docGrid w:linePitch="360"/>
     </w:sectPr>
   </w:body>
@@ -7280,6 +7476,26 @@
 </file>
 
 <file path=word/footer1.xml><?xml version="1.0" encoding="utf-8"?>
+<w:ftr xmlns:cx="http://schemas.microsoft.com/office/drawing/2014/chartex" xmlns:cx1="http://schemas.microsoft.com/office/drawing/2015/9/8/chartex" xmlns:cx2="http://schemas.microsoft.com/office/drawing/2015/10/21/chartex" xmlns:cx3="http://schemas.microsoft.com/office/drawing/2016/5/9/chartex" xmlns:cx4="http://schemas.microsoft.com/office/drawing/2016/5/10/chartex" xmlns:cx5="http://schemas.microsoft.com/office/drawing/2016/5/11/chartex" xmlns:cx6="http://schemas.microsoft.com/office/drawing/2016/5/12/chartex" xmlns:cx7="http://schemas.microsoft.com/office/drawing/2016/5/13/chartex" xmlns:cx8="http://schemas.microsoft.com/office/drawing/2016/5/14/chartex" xmlns:mc="http://schemas.openxmlformats.org/markup-compatibility/2006" xmlns:aink="http://schemas.microsoft.com/office/drawing/2016/ink" xmlns:am3d="http://schemas.microsoft.com/office/drawing/2017/model3d" xmlns:o="urn:schemas-microsoft-com:office:office" xmlns:oel="http://schemas.microsoft.com/office/2019/extlst" xmlns:r="http://purl.oclc.org/ooxml/officeDocument/relationships" xmlns:m="http://purl.oclc.org/ooxml/officeDocument/math" xmlns:v="urn:schemas-microsoft-com:vml" xmlns:wp14="http://schemas.microsoft.com/office/word/2010/wordprocessingDrawing" xmlns:wp="http://purl.oclc.org/ooxml/drawingml/wordprocessingDrawing" xmlns:w10="urn:schemas-microsoft-com:office:word" xmlns:w="http://purl.oclc.org/ooxml/wordprocessingml/main" xmlns:w14="http://schemas.microsoft.com/office/word/2010/wordml" xmlns:w15="http://schemas.microsoft.com/office/word/2012/wordml" xmlns:w16cex="http://schemas.microsoft.com/office/word/2018/wordml/cex" xmlns:w16cid="http://schemas.microsoft.com/office/word/2016/wordml/cid" xmlns:w16="http://schemas.microsoft.com/office/word/2018/wordml" xmlns:w16du="http://schemas.microsoft.com/office/word/2023/wordml/word16du" xmlns:w16sdtdh="http://schemas.microsoft.com/office/word/2020/wordml/sdtdatahash" xmlns:w16sdtfl="http://schemas.microsoft.com/office/word/2024/wordml/sdtformatlock" xmlns:w16se="http://schemas.microsoft.com/office/word/2015/wordml/symex" xmlns:wpi="http://schemas.microsoft.com/office/word/2010/wordprocessingInk" xmlns:wne="http://schemas.microsoft.com/office/word/2006/wordml" mc:Ignorable="w14 w15 w16se w16cid w16 w16cex w16sdtdh w16sdtfl w16du wne wp14">
+  <w:p>
+    <w:pPr>
+      <w:pStyle w:val="Footer"/>
+    </w:pPr>
+  </w:p>
+</w:ftr>
+</file>
+
+<file path=word/footer2.xml><?xml version="1.0" encoding="utf-8"?>
+<w:ftr xmlns:cx="http://schemas.microsoft.com/office/drawing/2014/chartex" xmlns:cx1="http://schemas.microsoft.com/office/drawing/2015/9/8/chartex" xmlns:cx2="http://schemas.microsoft.com/office/drawing/2015/10/21/chartex" xmlns:cx3="http://schemas.microsoft.com/office/drawing/2016/5/9/chartex" xmlns:cx4="http://schemas.microsoft.com/office/drawing/2016/5/10/chartex" xmlns:cx5="http://schemas.microsoft.com/office/drawing/2016/5/11/chartex" xmlns:cx6="http://schemas.microsoft.com/office/drawing/2016/5/12/chartex" xmlns:cx7="http://schemas.microsoft.com/office/drawing/2016/5/13/chartex" xmlns:cx8="http://schemas.microsoft.com/office/drawing/2016/5/14/chartex" xmlns:mc="http://schemas.openxmlformats.org/markup-compatibility/2006" xmlns:aink="http://schemas.microsoft.com/office/drawing/2016/ink" xmlns:am3d="http://schemas.microsoft.com/office/drawing/2017/model3d" xmlns:o="urn:schemas-microsoft-com:office:office" xmlns:oel="http://schemas.microsoft.com/office/2019/extlst" xmlns:r="http://purl.oclc.org/ooxml/officeDocument/relationships" xmlns:m="http://purl.oclc.org/ooxml/officeDocument/math" xmlns:v="urn:schemas-microsoft-com:vml" xmlns:wp14="http://schemas.microsoft.com/office/word/2010/wordprocessingDrawing" xmlns:wp="http://purl.oclc.org/ooxml/drawingml/wordprocessingDrawing" xmlns:w10="urn:schemas-microsoft-com:office:word" xmlns:w="http://purl.oclc.org/ooxml/wordprocessingml/main" xmlns:w14="http://schemas.microsoft.com/office/word/2010/wordml" xmlns:w15="http://schemas.microsoft.com/office/word/2012/wordml" xmlns:w16cex="http://schemas.microsoft.com/office/word/2018/wordml/cex" xmlns:w16cid="http://schemas.microsoft.com/office/word/2016/wordml/cid" xmlns:w16="http://schemas.microsoft.com/office/word/2018/wordml" xmlns:w16du="http://schemas.microsoft.com/office/word/2023/wordml/word16du" xmlns:w16sdtdh="http://schemas.microsoft.com/office/word/2020/wordml/sdtdatahash" xmlns:w16sdtfl="http://schemas.microsoft.com/office/word/2024/wordml/sdtformatlock" xmlns:w16se="http://schemas.microsoft.com/office/word/2015/wordml/symex" xmlns:wpi="http://schemas.microsoft.com/office/word/2010/wordprocessingInk" xmlns:wne="http://schemas.microsoft.com/office/word/2006/wordml" mc:Ignorable="w14 w15 w16se w16cid w16 w16cex w16sdtdh w16sdtfl w16du wne wp14">
+  <w:p>
+    <w:pPr>
+      <w:pStyle w:val="Footer"/>
+    </w:pPr>
+  </w:p>
+</w:ftr>
+</file>
+
+<file path=word/footer3.xml><?xml version="1.0" encoding="utf-8"?>
 <w:ftr xmlns:cx="http://schemas.microsoft.com/office/drawing/2014/chartex" xmlns:cx1="http://schemas.microsoft.com/office/drawing/2015/9/8/chartex" xmlns:cx2="http://schemas.microsoft.com/office/drawing/2015/10/21/chartex" xmlns:cx3="http://schemas.microsoft.com/office/drawing/2016/5/9/chartex" xmlns:cx4="http://schemas.microsoft.com/office/drawing/2016/5/10/chartex" xmlns:cx5="http://schemas.microsoft.com/office/drawing/2016/5/11/chartex" xmlns:cx6="http://schemas.microsoft.com/office/drawing/2016/5/12/chartex" xmlns:cx7="http://schemas.microsoft.com/office/drawing/2016/5/13/chartex" xmlns:cx8="http://schemas.microsoft.com/office/drawing/2016/5/14/chartex" xmlns:mc="http://schemas.openxmlformats.org/markup-compatibility/2006" xmlns:aink="http://schemas.microsoft.com/office/drawing/2016/ink" xmlns:am3d="http://schemas.microsoft.com/office/drawing/2017/model3d" xmlns:o="urn:schemas-microsoft-com:office:office" xmlns:oel="http://schemas.microsoft.com/office/2019/extlst" xmlns:r="http://purl.oclc.org/ooxml/officeDocument/relationships" xmlns:m="http://purl.oclc.org/ooxml/officeDocument/math" xmlns:v="urn:schemas-microsoft-com:vml" xmlns:wp14="http://schemas.microsoft.com/office/word/2010/wordprocessingDrawing" xmlns:wp="http://purl.oclc.org/ooxml/drawingml/wordprocessingDrawing" xmlns:w10="urn:schemas-microsoft-com:office:word" xmlns:w="http://purl.oclc.org/ooxml/wordprocessingml/main" xmlns:w14="http://schemas.microsoft.com/office/word/2010/wordml" xmlns:w15="http://schemas.microsoft.com/office/word/2012/wordml" xmlns:w16cex="http://schemas.microsoft.com/office/word/2018/wordml/cex" xmlns:w16cid="http://schemas.microsoft.com/office/word/2016/wordml/cid" xmlns:w16="http://schemas.microsoft.com/office/word/2018/wordml" xmlns:w16du="http://schemas.microsoft.com/office/word/2023/wordml/word16du" xmlns:w16sdtdh="http://schemas.microsoft.com/office/word/2020/wordml/sdtdatahash" xmlns:w16sdtfl="http://schemas.microsoft.com/office/word/2024/wordml/sdtformatlock" xmlns:w16se="http://schemas.microsoft.com/office/word/2015/wordml/symex" xmlns:wpi="http://schemas.microsoft.com/office/word/2010/wordprocessingInk" xmlns:wne="http://schemas.microsoft.com/office/word/2006/wordml" mc:Ignorable="w14 w15 w16se w16cid w16 w16cex w16sdtdh w16sdtfl w16du wne wp14">
   <w:p>
     <w:pPr>
@@ -7311,6 +7527,36 @@
     </w:p>
   </w:footnote>
 </w:footnotes>
+</file>
+
+<file path=word/header1.xml><?xml version="1.0" encoding="utf-8"?>
+<w:hdr xmlns:cx="http://schemas.microsoft.com/office/drawing/2014/chartex" xmlns:cx1="http://schemas.microsoft.com/office/drawing/2015/9/8/chartex" xmlns:cx2="http://schemas.microsoft.com/office/drawing/2015/10/21/chartex" xmlns:cx3="http://schemas.microsoft.com/office/drawing/2016/5/9/chartex" xmlns:cx4="http://schemas.microsoft.com/office/drawing/2016/5/10/chartex" xmlns:cx5="http://schemas.microsoft.com/office/drawing/2016/5/11/chartex" xmlns:cx6="http://schemas.microsoft.com/office/drawing/2016/5/12/chartex" xmlns:cx7="http://schemas.microsoft.com/office/drawing/2016/5/13/chartex" xmlns:cx8="http://schemas.microsoft.com/office/drawing/2016/5/14/chartex" xmlns:mc="http://schemas.openxmlformats.org/markup-compatibility/2006" xmlns:aink="http://schemas.microsoft.com/office/drawing/2016/ink" xmlns:am3d="http://schemas.microsoft.com/office/drawing/2017/model3d" xmlns:o="urn:schemas-microsoft-com:office:office" xmlns:oel="http://schemas.microsoft.com/office/2019/extlst" xmlns:r="http://purl.oclc.org/ooxml/officeDocument/relationships" xmlns:m="http://purl.oclc.org/ooxml/officeDocument/math" xmlns:v="urn:schemas-microsoft-com:vml" xmlns:wp14="http://schemas.microsoft.com/office/word/2010/wordprocessingDrawing" xmlns:wp="http://purl.oclc.org/ooxml/drawingml/wordprocessingDrawing" xmlns:w10="urn:schemas-microsoft-com:office:word" xmlns:w="http://purl.oclc.org/ooxml/wordprocessingml/main" xmlns:w14="http://schemas.microsoft.com/office/word/2010/wordml" xmlns:w15="http://schemas.microsoft.com/office/word/2012/wordml" xmlns:w16cex="http://schemas.microsoft.com/office/word/2018/wordml/cex" xmlns:w16cid="http://schemas.microsoft.com/office/word/2016/wordml/cid" xmlns:w16="http://schemas.microsoft.com/office/word/2018/wordml" xmlns:w16du="http://schemas.microsoft.com/office/word/2023/wordml/word16du" xmlns:w16sdtdh="http://schemas.microsoft.com/office/word/2020/wordml/sdtdatahash" xmlns:w16sdtfl="http://schemas.microsoft.com/office/word/2024/wordml/sdtformatlock" xmlns:w16se="http://schemas.microsoft.com/office/word/2015/wordml/symex" xmlns:wpi="http://schemas.microsoft.com/office/word/2010/wordprocessingInk" xmlns:wne="http://schemas.microsoft.com/office/word/2006/wordml" mc:Ignorable="w14 w15 w16se w16cid w16 w16cex w16sdtdh w16sdtfl w16du wne wp14">
+  <w:p>
+    <w:pPr>
+      <w:pStyle w:val="Header"/>
+    </w:pPr>
+  </w:p>
+</w:hdr>
+</file>
+
+<file path=word/header2.xml><?xml version="1.0" encoding="utf-8"?>
+<w:hdr xmlns:cx="http://schemas.microsoft.com/office/drawing/2014/chartex" xmlns:cx1="http://schemas.microsoft.com/office/drawing/2015/9/8/chartex" xmlns:cx2="http://schemas.microsoft.com/office/drawing/2015/10/21/chartex" xmlns:cx3="http://schemas.microsoft.com/office/drawing/2016/5/9/chartex" xmlns:cx4="http://schemas.microsoft.com/office/drawing/2016/5/10/chartex" xmlns:cx5="http://schemas.microsoft.com/office/drawing/2016/5/11/chartex" xmlns:cx6="http://schemas.microsoft.com/office/drawing/2016/5/12/chartex" xmlns:cx7="http://schemas.microsoft.com/office/drawing/2016/5/13/chartex" xmlns:cx8="http://schemas.microsoft.com/office/drawing/2016/5/14/chartex" xmlns:mc="http://schemas.openxmlformats.org/markup-compatibility/2006" xmlns:aink="http://schemas.microsoft.com/office/drawing/2016/ink" xmlns:am3d="http://schemas.microsoft.com/office/drawing/2017/model3d" xmlns:o="urn:schemas-microsoft-com:office:office" xmlns:oel="http://schemas.microsoft.com/office/2019/extlst" xmlns:r="http://purl.oclc.org/ooxml/officeDocument/relationships" xmlns:m="http://purl.oclc.org/ooxml/officeDocument/math" xmlns:v="urn:schemas-microsoft-com:vml" xmlns:wp14="http://schemas.microsoft.com/office/word/2010/wordprocessingDrawing" xmlns:wp="http://purl.oclc.org/ooxml/drawingml/wordprocessingDrawing" xmlns:w10="urn:schemas-microsoft-com:office:word" xmlns:w="http://purl.oclc.org/ooxml/wordprocessingml/main" xmlns:w14="http://schemas.microsoft.com/office/word/2010/wordml" xmlns:w15="http://schemas.microsoft.com/office/word/2012/wordml" xmlns:w16cex="http://schemas.microsoft.com/office/word/2018/wordml/cex" xmlns:w16cid="http://schemas.microsoft.com/office/word/2016/wordml/cid" xmlns:w16="http://schemas.microsoft.com/office/word/2018/wordml" xmlns:w16du="http://schemas.microsoft.com/office/word/2023/wordml/word16du" xmlns:w16sdtdh="http://schemas.microsoft.com/office/word/2020/wordml/sdtdatahash" xmlns:w16sdtfl="http://schemas.microsoft.com/office/word/2024/wordml/sdtformatlock" xmlns:w16se="http://schemas.microsoft.com/office/word/2015/wordml/symex" xmlns:wpi="http://schemas.microsoft.com/office/word/2010/wordprocessingInk" xmlns:wne="http://schemas.microsoft.com/office/word/2006/wordml" mc:Ignorable="w14 w15 w16se w16cid w16 w16cex w16sdtdh w16sdtfl w16du wne wp14">
+  <w:p>
+    <w:pPr>
+      <w:pStyle w:val="Header"/>
+    </w:pPr>
+  </w:p>
+</w:hdr>
+</file>
+
+<file path=word/header3.xml><?xml version="1.0" encoding="utf-8"?>
+<w:hdr xmlns:cx="http://schemas.microsoft.com/office/drawing/2014/chartex" xmlns:cx1="http://schemas.microsoft.com/office/drawing/2015/9/8/chartex" xmlns:cx2="http://schemas.microsoft.com/office/drawing/2015/10/21/chartex" xmlns:cx3="http://schemas.microsoft.com/office/drawing/2016/5/9/chartex" xmlns:cx4="http://schemas.microsoft.com/office/drawing/2016/5/10/chartex" xmlns:cx5="http://schemas.microsoft.com/office/drawing/2016/5/11/chartex" xmlns:cx6="http://schemas.microsoft.com/office/drawing/2016/5/12/chartex" xmlns:cx7="http://schemas.microsoft.com/office/drawing/2016/5/13/chartex" xmlns:cx8="http://schemas.microsoft.com/office/drawing/2016/5/14/chartex" xmlns:mc="http://schemas.openxmlformats.org/markup-compatibility/2006" xmlns:aink="http://schemas.microsoft.com/office/drawing/2016/ink" xmlns:am3d="http://schemas.microsoft.com/office/drawing/2017/model3d" xmlns:o="urn:schemas-microsoft-com:office:office" xmlns:oel="http://schemas.microsoft.com/office/2019/extlst" xmlns:r="http://purl.oclc.org/ooxml/officeDocument/relationships" xmlns:m="http://purl.oclc.org/ooxml/officeDocument/math" xmlns:v="urn:schemas-microsoft-com:vml" xmlns:wp14="http://schemas.microsoft.com/office/word/2010/wordprocessingDrawing" xmlns:wp="http://purl.oclc.org/ooxml/drawingml/wordprocessingDrawing" xmlns:w10="urn:schemas-microsoft-com:office:word" xmlns:w="http://purl.oclc.org/ooxml/wordprocessingml/main" xmlns:w14="http://schemas.microsoft.com/office/word/2010/wordml" xmlns:w15="http://schemas.microsoft.com/office/word/2012/wordml" xmlns:w16cex="http://schemas.microsoft.com/office/word/2018/wordml/cex" xmlns:w16cid="http://schemas.microsoft.com/office/word/2016/wordml/cid" xmlns:w16="http://schemas.microsoft.com/office/word/2018/wordml" xmlns:w16du="http://schemas.microsoft.com/office/word/2023/wordml/word16du" xmlns:w16sdtdh="http://schemas.microsoft.com/office/word/2020/wordml/sdtdatahash" xmlns:w16sdtfl="http://schemas.microsoft.com/office/word/2024/wordml/sdtformatlock" xmlns:w16se="http://schemas.microsoft.com/office/word/2015/wordml/symex" xmlns:wpi="http://schemas.microsoft.com/office/word/2010/wordprocessingInk" xmlns:wne="http://schemas.microsoft.com/office/word/2006/wordml" mc:Ignorable="w14 w15 w16se w16cid w16 w16cex w16sdtdh w16sdtfl w16du wne wp14">
+  <w:p>
+    <w:pPr>
+      <w:pStyle w:val="Header"/>
+    </w:pPr>
+  </w:p>
+</w:hdr>
 </file>
 
 <file path=word/numbering.xml><?xml version="1.0" encoding="utf-8"?>
@@ -8193,7 +8439,7 @@
   <w:abstractNum w:abstractNumId="16" w15:restartNumberingAfterBreak="0">
     <w:nsid w:val="4189603E"/>
     <w:multiLevelType w:val="multilevel"/>
-    <w:tmpl w:val="0AB06E12"/>
+    <w:tmpl w:val="2A821A7A"/>
     <w:lvl w:ilvl="0">
       <w:start w:val="1"/>
       <w:numFmt w:val="upperRoman"/>
@@ -8318,6 +8564,7 @@
         <w:iCs/>
         <w:sz w:val="20"/>
         <w:szCs w:val="20"/>
+        <w:lang w:val="en-IE"/>
       </w:rPr>
     </w:lvl>
     <w:lvl w:ilvl="4">

</xml_diff>